<commit_message>
Usar los montos reales en el resumen de la pollada
Efectivo 1294, POS 880, Yape 1046, deuda 1520, sub total 4740. Se deja
al lado la suma de las listas del cuaderno para ver la diferencia.

Co-Authored-By: Claude Opus 5.5 <noreply@anthropic.com>
Claude-Session: https://claude.ai/code/session_01YEheGr64JSg4QrBmL1Wt5a
</commit_message>
<xml_diff>
--- a/pollada/Registro_Pollada.docx
+++ b/pollada/Registro_Pollada.docx
@@ -52,50 +52,54 @@
         </w:tblBorders>
       </w:tblPr>
       <w:tblGrid>
-        <w:gridCol w:w="5000"/>
-        <w:gridCol w:w="4026"/>
+        <w:gridCol w:w="4400"/>
+        <w:gridCol w:w="2313"/>
+        <w:gridCol w:w="2313"/>
       </w:tblGrid>
       <w:tr>
         <w:tc>
           <w:tcPr>
-            <w:tcW w:type="dxa" w:w="5000"/>
-            <w:tcBorders>
-              <w:top w:val="single" w:color="BBBBBB" w:sz="4"/>
-              <w:left w:val="single" w:color="BBBBBB" w:sz="4"/>
-              <w:bottom w:val="single" w:color="BBBBBB" w:sz="4"/>
-              <w:right w:val="single" w:color="BBBBBB" w:sz="4"/>
-            </w:tcBorders>
-            <w:tcMar>
-              <w:top w:type="dxa" w:w="60"/>
-              <w:left w:type="dxa" w:w="100"/>
-              <w:bottom w:type="dxa" w:w="60"/>
-              <w:right w:type="dxa" w:w="100"/>
-            </w:tcMar>
-          </w:tcPr>
-          <w:p>
-            <w:pPr>
-              <w:jc w:val="left"/>
-            </w:pPr>
-            <w:r>
-              <w:rPr>
-                <w:b w:val="false"/>
-                <w:bCs w:val="false"/>
-                <w:sz w:val="20"/>
-                <w:szCs w:val="20"/>
-              </w:rPr>
-              <w:t xml:space="preserve">Efectivo</w:t>
-            </w:r>
-          </w:p>
-        </w:tc>
-        <w:tc>
-          <w:tcPr>
-            <w:tcW w:type="dxa" w:w="4026"/>
-            <w:tcBorders>
-              <w:top w:val="single" w:color="BBBBBB" w:sz="4"/>
-              <w:left w:val="single" w:color="BBBBBB" w:sz="4"/>
-              <w:bottom w:val="single" w:color="BBBBBB" w:sz="4"/>
-              <w:right w:val="single" w:color="BBBBBB" w:sz="4"/>
-            </w:tcBorders>
+            <w:tcW w:type="dxa" w:w="4400"/>
+            <w:tcBorders>
+              <w:top w:val="single" w:color="BBBBBB" w:sz="4"/>
+              <w:left w:val="single" w:color="BBBBBB" w:sz="4"/>
+              <w:bottom w:val="single" w:color="BBBBBB" w:sz="4"/>
+              <w:right w:val="single" w:color="BBBBBB" w:sz="4"/>
+            </w:tcBorders>
+            <w:shd w:fill="424242" w:color="auto" w:val="clear"/>
+            <w:tcMar>
+              <w:top w:type="dxa" w:w="60"/>
+              <w:left w:type="dxa" w:w="100"/>
+              <w:bottom w:type="dxa" w:w="60"/>
+              <w:right w:type="dxa" w:w="100"/>
+            </w:tcMar>
+          </w:tcPr>
+          <w:p>
+            <w:pPr>
+              <w:jc w:val="left"/>
+            </w:pPr>
+            <w:r>
+              <w:rPr>
+                <w:b/>
+                <w:bCs/>
+                <w:color w:val="FFFFFF"/>
+                <w:sz w:val="20"/>
+                <w:szCs w:val="20"/>
+              </w:rPr>
+              <w:t xml:space="preserve">Concepto</w:t>
+            </w:r>
+          </w:p>
+        </w:tc>
+        <w:tc>
+          <w:tcPr>
+            <w:tcW w:type="dxa" w:w="2313"/>
+            <w:tcBorders>
+              <w:top w:val="single" w:color="BBBBBB" w:sz="4"/>
+              <w:left w:val="single" w:color="BBBBBB" w:sz="4"/>
+              <w:bottom w:val="single" w:color="BBBBBB" w:sz="4"/>
+              <w:right w:val="single" w:color="BBBBBB" w:sz="4"/>
+            </w:tcBorders>
+            <w:shd w:fill="424242" w:color="auto" w:val="clear"/>
             <w:tcMar>
               <w:top w:type="dxa" w:w="60"/>
               <w:left w:type="dxa" w:w="100"/>
@@ -109,12 +113,46 @@
             </w:pPr>
             <w:r>
               <w:rPr>
-                <w:b w:val="false"/>
-                <w:bCs w:val="false"/>
-                <w:sz w:val="20"/>
-                <w:szCs w:val="20"/>
-              </w:rPr>
-              <w:t xml:space="preserve">S/ 1,014</w:t>
+                <w:b/>
+                <w:bCs/>
+                <w:color w:val="FFFFFF"/>
+                <w:sz w:val="20"/>
+                <w:szCs w:val="20"/>
+              </w:rPr>
+              <w:t xml:space="preserve">Monto real</w:t>
+            </w:r>
+          </w:p>
+        </w:tc>
+        <w:tc>
+          <w:tcPr>
+            <w:tcW w:type="dxa" w:w="2313"/>
+            <w:tcBorders>
+              <w:top w:val="single" w:color="BBBBBB" w:sz="4"/>
+              <w:left w:val="single" w:color="BBBBBB" w:sz="4"/>
+              <w:bottom w:val="single" w:color="BBBBBB" w:sz="4"/>
+              <w:right w:val="single" w:color="BBBBBB" w:sz="4"/>
+            </w:tcBorders>
+            <w:shd w:fill="424242" w:color="auto" w:val="clear"/>
+            <w:tcMar>
+              <w:top w:type="dxa" w:w="60"/>
+              <w:left w:type="dxa" w:w="100"/>
+              <w:bottom w:type="dxa" w:w="60"/>
+              <w:right w:type="dxa" w:w="100"/>
+            </w:tcMar>
+          </w:tcPr>
+          <w:p>
+            <w:pPr>
+              <w:jc w:val="right"/>
+            </w:pPr>
+            <w:r>
+              <w:rPr>
+                <w:b/>
+                <w:bCs/>
+                <w:color w:val="FFFFFF"/>
+                <w:sz w:val="18"/>
+                <w:szCs w:val="18"/>
+              </w:rPr>
+              <w:t xml:space="preserve">Suma de las listas</w:t>
             </w:r>
           </w:p>
         </w:tc>
@@ -122,38 +160,38 @@
       <w:tr>
         <w:tc>
           <w:tcPr>
-            <w:tcW w:type="dxa" w:w="5000"/>
-            <w:tcBorders>
-              <w:top w:val="single" w:color="BBBBBB" w:sz="4"/>
-              <w:left w:val="single" w:color="BBBBBB" w:sz="4"/>
-              <w:bottom w:val="single" w:color="BBBBBB" w:sz="4"/>
-              <w:right w:val="single" w:color="BBBBBB" w:sz="4"/>
-            </w:tcBorders>
-            <w:tcMar>
-              <w:top w:type="dxa" w:w="60"/>
-              <w:left w:type="dxa" w:w="100"/>
-              <w:bottom w:type="dxa" w:w="60"/>
-              <w:right w:type="dxa" w:w="100"/>
-            </w:tcMar>
-          </w:tcPr>
-          <w:p>
-            <w:pPr>
-              <w:jc w:val="left"/>
-            </w:pPr>
-            <w:r>
-              <w:rPr>
-                <w:b w:val="false"/>
-                <w:bCs w:val="false"/>
-                <w:sz w:val="20"/>
-                <w:szCs w:val="20"/>
-              </w:rPr>
-              <w:t xml:space="preserve">Yape</w:t>
-            </w:r>
-          </w:p>
-        </w:tc>
-        <w:tc>
-          <w:tcPr>
-            <w:tcW w:type="dxa" w:w="4026"/>
+            <w:tcW w:type="dxa" w:w="4400"/>
+            <w:tcBorders>
+              <w:top w:val="single" w:color="BBBBBB" w:sz="4"/>
+              <w:left w:val="single" w:color="BBBBBB" w:sz="4"/>
+              <w:bottom w:val="single" w:color="BBBBBB" w:sz="4"/>
+              <w:right w:val="single" w:color="BBBBBB" w:sz="4"/>
+            </w:tcBorders>
+            <w:tcMar>
+              <w:top w:type="dxa" w:w="60"/>
+              <w:left w:type="dxa" w:w="100"/>
+              <w:bottom w:type="dxa" w:w="60"/>
+              <w:right w:type="dxa" w:w="100"/>
+            </w:tcMar>
+          </w:tcPr>
+          <w:p>
+            <w:pPr>
+              <w:jc w:val="left"/>
+            </w:pPr>
+            <w:r>
+              <w:rPr>
+                <w:b w:val="false"/>
+                <w:bCs w:val="false"/>
+                <w:sz w:val="20"/>
+                <w:szCs w:val="20"/>
+              </w:rPr>
+              <w:t xml:space="preserve">Efectivo real</w:t>
+            </w:r>
+          </w:p>
+        </w:tc>
+        <w:tc>
+          <w:tcPr>
+            <w:tcW w:type="dxa" w:w="2313"/>
             <w:tcBorders>
               <w:top w:val="single" w:color="BBBBBB" w:sz="4"/>
               <w:left w:val="single" w:color="BBBBBB" w:sz="4"/>
@@ -178,7 +216,40 @@
                 <w:sz w:val="20"/>
                 <w:szCs w:val="20"/>
               </w:rPr>
-              <w:t xml:space="preserve">S/ 1,146</w:t>
+              <w:t xml:space="preserve">S/ 1,294</w:t>
+            </w:r>
+          </w:p>
+        </w:tc>
+        <w:tc>
+          <w:tcPr>
+            <w:tcW w:type="dxa" w:w="2313"/>
+            <w:tcBorders>
+              <w:top w:val="single" w:color="BBBBBB" w:sz="4"/>
+              <w:left w:val="single" w:color="BBBBBB" w:sz="4"/>
+              <w:bottom w:val="single" w:color="BBBBBB" w:sz="4"/>
+              <w:right w:val="single" w:color="BBBBBB" w:sz="4"/>
+            </w:tcBorders>
+            <w:shd w:fill="FAFAFA" w:color="auto" w:val="clear"/>
+            <w:tcMar>
+              <w:top w:type="dxa" w:w="60"/>
+              <w:left w:type="dxa" w:w="100"/>
+              <w:bottom w:type="dxa" w:w="60"/>
+              <w:right w:type="dxa" w:w="100"/>
+            </w:tcMar>
+          </w:tcPr>
+          <w:p>
+            <w:pPr>
+              <w:jc w:val="right"/>
+            </w:pPr>
+            <w:r>
+              <w:rPr>
+                <w:b w:val="false"/>
+                <w:bCs w:val="false"/>
+                <w:color w:val="777777"/>
+                <w:sz w:val="18"/>
+                <w:szCs w:val="18"/>
+              </w:rPr>
+              <w:t xml:space="preserve">S/ 1,014</w:t>
             </w:r>
           </w:p>
         </w:tc>
@@ -186,7 +257,7 @@
       <w:tr>
         <w:tc>
           <w:tcPr>
-            <w:tcW w:type="dxa" w:w="5000"/>
+            <w:tcW w:type="dxa" w:w="4400"/>
             <w:tcBorders>
               <w:top w:val="single" w:color="BBBBBB" w:sz="4"/>
               <w:left w:val="single" w:color="BBBBBB" w:sz="4"/>
@@ -217,7 +288,7 @@
         </w:tc>
         <w:tc>
           <w:tcPr>
-            <w:tcW w:type="dxa" w:w="4026"/>
+            <w:tcW w:type="dxa" w:w="2313"/>
             <w:tcBorders>
               <w:top w:val="single" w:color="BBBBBB" w:sz="4"/>
               <w:left w:val="single" w:color="BBBBBB" w:sz="4"/>
@@ -241,6 +312,39 @@
                 <w:bCs w:val="false"/>
                 <w:sz w:val="20"/>
                 <w:szCs w:val="20"/>
+              </w:rPr>
+              <w:t xml:space="preserve">S/ 880</w:t>
+            </w:r>
+          </w:p>
+        </w:tc>
+        <w:tc>
+          <w:tcPr>
+            <w:tcW w:type="dxa" w:w="2313"/>
+            <w:tcBorders>
+              <w:top w:val="single" w:color="BBBBBB" w:sz="4"/>
+              <w:left w:val="single" w:color="BBBBBB" w:sz="4"/>
+              <w:bottom w:val="single" w:color="BBBBBB" w:sz="4"/>
+              <w:right w:val="single" w:color="BBBBBB" w:sz="4"/>
+            </w:tcBorders>
+            <w:shd w:fill="FAFAFA" w:color="auto" w:val="clear"/>
+            <w:tcMar>
+              <w:top w:type="dxa" w:w="60"/>
+              <w:left w:type="dxa" w:w="100"/>
+              <w:bottom w:type="dxa" w:w="60"/>
+              <w:right w:type="dxa" w:w="100"/>
+            </w:tcMar>
+          </w:tcPr>
+          <w:p>
+            <w:pPr>
+              <w:jc w:val="right"/>
+            </w:pPr>
+            <w:r>
+              <w:rPr>
+                <w:b w:val="false"/>
+                <w:bCs w:val="false"/>
+                <w:color w:val="777777"/>
+                <w:sz w:val="18"/>
+                <w:szCs w:val="18"/>
               </w:rPr>
               <w:t xml:space="preserve">S/ 900</w:t>
             </w:r>
@@ -250,38 +354,38 @@
       <w:tr>
         <w:tc>
           <w:tcPr>
-            <w:tcW w:type="dxa" w:w="5000"/>
-            <w:tcBorders>
-              <w:top w:val="single" w:color="BBBBBB" w:sz="4"/>
-              <w:left w:val="single" w:color="BBBBBB" w:sz="4"/>
-              <w:bottom w:val="single" w:color="BBBBBB" w:sz="4"/>
-              <w:right w:val="single" w:color="BBBBBB" w:sz="4"/>
-            </w:tcBorders>
-            <w:tcMar>
-              <w:top w:type="dxa" w:w="60"/>
-              <w:left w:type="dxa" w:w="100"/>
-              <w:bottom w:type="dxa" w:w="60"/>
-              <w:right w:type="dxa" w:w="100"/>
-            </w:tcMar>
-          </w:tcPr>
-          <w:p>
-            <w:pPr>
-              <w:jc w:val="left"/>
-            </w:pPr>
-            <w:r>
-              <w:rPr>
-                <w:b w:val="false"/>
-                <w:bCs w:val="false"/>
-                <w:sz w:val="20"/>
-                <w:szCs w:val="20"/>
-              </w:rPr>
-              <w:t xml:space="preserve">Pagos sin método anotado (Cosme Christian 20, Yimi mecánico 20)</w:t>
-            </w:r>
-          </w:p>
-        </w:tc>
-        <w:tc>
-          <w:tcPr>
-            <w:tcW w:type="dxa" w:w="4026"/>
+            <w:tcW w:type="dxa" w:w="4400"/>
+            <w:tcBorders>
+              <w:top w:val="single" w:color="BBBBBB" w:sz="4"/>
+              <w:left w:val="single" w:color="BBBBBB" w:sz="4"/>
+              <w:bottom w:val="single" w:color="BBBBBB" w:sz="4"/>
+              <w:right w:val="single" w:color="BBBBBB" w:sz="4"/>
+            </w:tcBorders>
+            <w:tcMar>
+              <w:top w:type="dxa" w:w="60"/>
+              <w:left w:type="dxa" w:w="100"/>
+              <w:bottom w:type="dxa" w:w="60"/>
+              <w:right w:type="dxa" w:w="100"/>
+            </w:tcMar>
+          </w:tcPr>
+          <w:p>
+            <w:pPr>
+              <w:jc w:val="left"/>
+            </w:pPr>
+            <w:r>
+              <w:rPr>
+                <w:b w:val="false"/>
+                <w:bCs w:val="false"/>
+                <w:sz w:val="20"/>
+                <w:szCs w:val="20"/>
+              </w:rPr>
+              <w:t xml:space="preserve">Yape</w:t>
+            </w:r>
+          </w:p>
+        </w:tc>
+        <w:tc>
+          <w:tcPr>
+            <w:tcW w:type="dxa" w:w="2313"/>
             <w:tcBorders>
               <w:top w:val="single" w:color="BBBBBB" w:sz="4"/>
               <w:left w:val="single" w:color="BBBBBB" w:sz="4"/>
@@ -306,7 +410,40 @@
                 <w:sz w:val="20"/>
                 <w:szCs w:val="20"/>
               </w:rPr>
-              <w:t xml:space="preserve">S/ 40</w:t>
+              <w:t xml:space="preserve">S/ 1,046</w:t>
+            </w:r>
+          </w:p>
+        </w:tc>
+        <w:tc>
+          <w:tcPr>
+            <w:tcW w:type="dxa" w:w="2313"/>
+            <w:tcBorders>
+              <w:top w:val="single" w:color="BBBBBB" w:sz="4"/>
+              <w:left w:val="single" w:color="BBBBBB" w:sz="4"/>
+              <w:bottom w:val="single" w:color="BBBBBB" w:sz="4"/>
+              <w:right w:val="single" w:color="BBBBBB" w:sz="4"/>
+            </w:tcBorders>
+            <w:shd w:fill="FAFAFA" w:color="auto" w:val="clear"/>
+            <w:tcMar>
+              <w:top w:type="dxa" w:w="60"/>
+              <w:left w:type="dxa" w:w="100"/>
+              <w:bottom w:type="dxa" w:w="60"/>
+              <w:right w:type="dxa" w:w="100"/>
+            </w:tcMar>
+          </w:tcPr>
+          <w:p>
+            <w:pPr>
+              <w:jc w:val="right"/>
+            </w:pPr>
+            <w:r>
+              <w:rPr>
+                <w:b w:val="false"/>
+                <w:bCs w:val="false"/>
+                <w:color w:val="777777"/>
+                <w:sz w:val="18"/>
+                <w:szCs w:val="18"/>
+              </w:rPr>
+              <w:t xml:space="preserve">S/ 1,146</w:t>
             </w:r>
           </w:p>
         </w:tc>
@@ -314,7 +451,104 @@
       <w:tr>
         <w:tc>
           <w:tcPr>
-            <w:tcW w:type="dxa" w:w="5000"/>
+            <w:tcW w:type="dxa" w:w="4400"/>
+            <w:tcBorders>
+              <w:top w:val="single" w:color="BBBBBB" w:sz="4"/>
+              <w:left w:val="single" w:color="BBBBBB" w:sz="4"/>
+              <w:bottom w:val="single" w:color="BBBBBB" w:sz="4"/>
+              <w:right w:val="single" w:color="BBBBBB" w:sz="4"/>
+            </w:tcBorders>
+            <w:tcMar>
+              <w:top w:type="dxa" w:w="60"/>
+              <w:left w:type="dxa" w:w="100"/>
+              <w:bottom w:type="dxa" w:w="60"/>
+              <w:right w:type="dxa" w:w="100"/>
+            </w:tcMar>
+          </w:tcPr>
+          <w:p>
+            <w:pPr>
+              <w:jc w:val="left"/>
+            </w:pPr>
+            <w:r>
+              <w:rPr>
+                <w:b w:val="false"/>
+                <w:bCs w:val="false"/>
+                <w:sz w:val="20"/>
+                <w:szCs w:val="20"/>
+              </w:rPr>
+              <w:t xml:space="preserve">Pagos sin método anotado</w:t>
+            </w:r>
+          </w:p>
+        </w:tc>
+        <w:tc>
+          <w:tcPr>
+            <w:tcW w:type="dxa" w:w="2313"/>
+            <w:tcBorders>
+              <w:top w:val="single" w:color="BBBBBB" w:sz="4"/>
+              <w:left w:val="single" w:color="BBBBBB" w:sz="4"/>
+              <w:bottom w:val="single" w:color="BBBBBB" w:sz="4"/>
+              <w:right w:val="single" w:color="BBBBBB" w:sz="4"/>
+            </w:tcBorders>
+            <w:tcMar>
+              <w:top w:type="dxa" w:w="60"/>
+              <w:left w:type="dxa" w:w="100"/>
+              <w:bottom w:type="dxa" w:w="60"/>
+              <w:right w:type="dxa" w:w="100"/>
+            </w:tcMar>
+          </w:tcPr>
+          <w:p>
+            <w:pPr>
+              <w:jc w:val="right"/>
+            </w:pPr>
+            <w:r>
+              <w:rPr>
+                <w:b w:val="false"/>
+                <w:bCs w:val="false"/>
+                <w:sz w:val="20"/>
+                <w:szCs w:val="20"/>
+              </w:rPr>
+              <w:t xml:space="preserve">—</w:t>
+            </w:r>
+          </w:p>
+        </w:tc>
+        <w:tc>
+          <w:tcPr>
+            <w:tcW w:type="dxa" w:w="2313"/>
+            <w:tcBorders>
+              <w:top w:val="single" w:color="BBBBBB" w:sz="4"/>
+              <w:left w:val="single" w:color="BBBBBB" w:sz="4"/>
+              <w:bottom w:val="single" w:color="BBBBBB" w:sz="4"/>
+              <w:right w:val="single" w:color="BBBBBB" w:sz="4"/>
+            </w:tcBorders>
+            <w:shd w:fill="FAFAFA" w:color="auto" w:val="clear"/>
+            <w:tcMar>
+              <w:top w:type="dxa" w:w="60"/>
+              <w:left w:type="dxa" w:w="100"/>
+              <w:bottom w:type="dxa" w:w="60"/>
+              <w:right w:type="dxa" w:w="100"/>
+            </w:tcMar>
+          </w:tcPr>
+          <w:p>
+            <w:pPr>
+              <w:jc w:val="right"/>
+            </w:pPr>
+            <w:r>
+              <w:rPr>
+                <w:b w:val="false"/>
+                <w:bCs w:val="false"/>
+                <w:color w:val="777777"/>
+                <w:sz w:val="18"/>
+                <w:szCs w:val="18"/>
+              </w:rPr>
+              <w:t xml:space="preserve">S/ 40</w:t>
+            </w:r>
+          </w:p>
+        </w:tc>
+      </w:tr>
+      <w:tr>
+        <w:tc>
+          <w:tcPr>
+            <w:tcW w:type="dxa" w:w="4400"/>
             <w:tcBorders>
               <w:top w:val="single" w:color="BBBBBB" w:sz="4"/>
               <w:left w:val="single" w:color="BBBBBB" w:sz="4"/>
@@ -346,7 +580,7 @@
         </w:tc>
         <w:tc>
           <w:tcPr>
-            <w:tcW w:type="dxa" w:w="4026"/>
+            <w:tcW w:type="dxa" w:w="2313"/>
             <w:tcBorders>
               <w:top w:val="single" w:color="BBBBBB" w:sz="4"/>
               <w:left w:val="single" w:color="BBBBBB" w:sz="4"/>
@@ -372,6 +606,39 @@
                 <w:sz w:val="20"/>
                 <w:szCs w:val="20"/>
               </w:rPr>
+              <w:t xml:space="preserve">S/ 3,220</w:t>
+            </w:r>
+          </w:p>
+        </w:tc>
+        <w:tc>
+          <w:tcPr>
+            <w:tcW w:type="dxa" w:w="2313"/>
+            <w:tcBorders>
+              <w:top w:val="single" w:color="BBBBBB" w:sz="4"/>
+              <w:left w:val="single" w:color="BBBBBB" w:sz="4"/>
+              <w:bottom w:val="single" w:color="BBBBBB" w:sz="4"/>
+              <w:right w:val="single" w:color="BBBBBB" w:sz="4"/>
+            </w:tcBorders>
+            <w:shd w:fill="E3F2E5" w:color="auto" w:val="clear"/>
+            <w:tcMar>
+              <w:top w:type="dxa" w:w="60"/>
+              <w:left w:type="dxa" w:w="100"/>
+              <w:bottom w:type="dxa" w:w="60"/>
+              <w:right w:type="dxa" w:w="100"/>
+            </w:tcMar>
+          </w:tcPr>
+          <w:p>
+            <w:pPr>
+              <w:jc w:val="right"/>
+            </w:pPr>
+            <w:r>
+              <w:rPr>
+                <w:b/>
+                <w:bCs/>
+                <w:color w:val="777777"/>
+                <w:sz w:val="18"/>
+                <w:szCs w:val="18"/>
+              </w:rPr>
               <w:t xml:space="preserve">S/ 3,100</w:t>
             </w:r>
           </w:p>
@@ -380,7 +647,7 @@
       <w:tr>
         <w:tc>
           <w:tcPr>
-            <w:tcW w:type="dxa" w:w="5000"/>
+            <w:tcW w:type="dxa" w:w="4400"/>
             <w:tcBorders>
               <w:top w:val="single" w:color="BBBBBB" w:sz="4"/>
               <w:left w:val="single" w:color="BBBBBB" w:sz="4"/>
@@ -406,13 +673,13 @@
                 <w:sz w:val="20"/>
                 <w:szCs w:val="20"/>
               </w:rPr>
-              <w:t xml:space="preserve">FALTAN PAGAR</w:t>
-            </w:r>
-          </w:p>
-        </w:tc>
-        <w:tc>
-          <w:tcPr>
-            <w:tcW w:type="dxa" w:w="4026"/>
+              <w:t xml:space="preserve">DEUDA (faltan pagar)</w:t>
+            </w:r>
+          </w:p>
+        </w:tc>
+        <w:tc>
+          <w:tcPr>
+            <w:tcW w:type="dxa" w:w="2313"/>
             <w:tcBorders>
               <w:top w:val="single" w:color="BBBBBB" w:sz="4"/>
               <w:left w:val="single" w:color="BBBBBB" w:sz="4"/>
@@ -438,6 +705,39 @@
                 <w:sz w:val="20"/>
                 <w:szCs w:val="20"/>
               </w:rPr>
+              <w:t xml:space="preserve">S/ 1,520</w:t>
+            </w:r>
+          </w:p>
+        </w:tc>
+        <w:tc>
+          <w:tcPr>
+            <w:tcW w:type="dxa" w:w="2313"/>
+            <w:tcBorders>
+              <w:top w:val="single" w:color="BBBBBB" w:sz="4"/>
+              <w:left w:val="single" w:color="BBBBBB" w:sz="4"/>
+              <w:bottom w:val="single" w:color="BBBBBB" w:sz="4"/>
+              <w:right w:val="single" w:color="BBBBBB" w:sz="4"/>
+            </w:tcBorders>
+            <w:shd w:fill="FCE4E4" w:color="auto" w:val="clear"/>
+            <w:tcMar>
+              <w:top w:type="dxa" w:w="60"/>
+              <w:left w:type="dxa" w:w="100"/>
+              <w:bottom w:type="dxa" w:w="60"/>
+              <w:right w:type="dxa" w:w="100"/>
+            </w:tcMar>
+          </w:tcPr>
+          <w:p>
+            <w:pPr>
+              <w:jc w:val="right"/>
+            </w:pPr>
+            <w:r>
+              <w:rPr>
+                <w:b/>
+                <w:bCs/>
+                <w:color w:val="777777"/>
+                <w:sz w:val="18"/>
+                <w:szCs w:val="18"/>
+              </w:rPr>
               <w:t xml:space="preserve">S/ 1,500</w:t>
             </w:r>
           </w:p>
@@ -446,14 +746,14 @@
       <w:tr>
         <w:tc>
           <w:tcPr>
-            <w:tcW w:type="dxa" w:w="5000"/>
-            <w:tcBorders>
-              <w:top w:val="single" w:color="BBBBBB" w:sz="4"/>
-              <w:left w:val="single" w:color="BBBBBB" w:sz="4"/>
-              <w:bottom w:val="single" w:color="BBBBBB" w:sz="4"/>
-              <w:right w:val="single" w:color="BBBBBB" w:sz="4"/>
-            </w:tcBorders>
-            <w:shd w:fill="E8E8E8" w:color="auto" w:val="clear"/>
+            <w:tcW w:type="dxa" w:w="4400"/>
+            <w:tcBorders>
+              <w:top w:val="single" w:color="BBBBBB" w:sz="4"/>
+              <w:left w:val="single" w:color="BBBBBB" w:sz="4"/>
+              <w:bottom w:val="single" w:color="BBBBBB" w:sz="4"/>
+              <w:right w:val="single" w:color="BBBBBB" w:sz="4"/>
+            </w:tcBorders>
+            <w:shd w:fill="FFF3C4" w:color="auto" w:val="clear"/>
             <w:tcMar>
               <w:top w:type="dxa" w:w="60"/>
               <w:left w:type="dxa" w:w="100"/>
@@ -472,20 +772,20 @@
                 <w:sz w:val="20"/>
                 <w:szCs w:val="20"/>
               </w:rPr>
-              <w:t xml:space="preserve">TOTAL ANOTADO (cobrado + por cobrar)</w:t>
-            </w:r>
-          </w:p>
-        </w:tc>
-        <w:tc>
-          <w:tcPr>
-            <w:tcW w:type="dxa" w:w="4026"/>
-            <w:tcBorders>
-              <w:top w:val="single" w:color="BBBBBB" w:sz="4"/>
-              <w:left w:val="single" w:color="BBBBBB" w:sz="4"/>
-              <w:bottom w:val="single" w:color="BBBBBB" w:sz="4"/>
-              <w:right w:val="single" w:color="BBBBBB" w:sz="4"/>
-            </w:tcBorders>
-            <w:shd w:fill="E8E8E8" w:color="auto" w:val="clear"/>
+              <w:t xml:space="preserve">SUB TOTAL REAL</w:t>
+            </w:r>
+          </w:p>
+        </w:tc>
+        <w:tc>
+          <w:tcPr>
+            <w:tcW w:type="dxa" w:w="2313"/>
+            <w:tcBorders>
+              <w:top w:val="single" w:color="BBBBBB" w:sz="4"/>
+              <w:left w:val="single" w:color="BBBBBB" w:sz="4"/>
+              <w:bottom w:val="single" w:color="BBBBBB" w:sz="4"/>
+              <w:right w:val="single" w:color="BBBBBB" w:sz="4"/>
+            </w:tcBorders>
+            <w:shd w:fill="FFF3C4" w:color="auto" w:val="clear"/>
             <w:tcMar>
               <w:top w:type="dxa" w:w="60"/>
               <w:left w:type="dxa" w:w="100"/>
@@ -504,6 +804,39 @@
                 <w:sz w:val="20"/>
                 <w:szCs w:val="20"/>
               </w:rPr>
+              <w:t xml:space="preserve">S/ 4,740</w:t>
+            </w:r>
+          </w:p>
+        </w:tc>
+        <w:tc>
+          <w:tcPr>
+            <w:tcW w:type="dxa" w:w="2313"/>
+            <w:tcBorders>
+              <w:top w:val="single" w:color="BBBBBB" w:sz="4"/>
+              <w:left w:val="single" w:color="BBBBBB" w:sz="4"/>
+              <w:bottom w:val="single" w:color="BBBBBB" w:sz="4"/>
+              <w:right w:val="single" w:color="BBBBBB" w:sz="4"/>
+            </w:tcBorders>
+            <w:shd w:fill="FFF3C4" w:color="auto" w:val="clear"/>
+            <w:tcMar>
+              <w:top w:type="dxa" w:w="60"/>
+              <w:left w:type="dxa" w:w="100"/>
+              <w:bottom w:type="dxa" w:w="60"/>
+              <w:right w:type="dxa" w:w="100"/>
+            </w:tcMar>
+          </w:tcPr>
+          <w:p>
+            <w:pPr>
+              <w:jc w:val="right"/>
+            </w:pPr>
+            <w:r>
+              <w:rPr>
+                <w:b/>
+                <w:bCs/>
+                <w:color w:val="777777"/>
+                <w:sz w:val="18"/>
+                <w:szCs w:val="18"/>
+              </w:rPr>
               <w:t xml:space="preserve">S/ 4,600</w:t>
             </w:r>
           </w:p>
@@ -512,38 +845,38 @@
       <w:tr>
         <w:tc>
           <w:tcPr>
-            <w:tcW w:type="dxa" w:w="5000"/>
-            <w:tcBorders>
-              <w:top w:val="single" w:color="BBBBBB" w:sz="4"/>
-              <w:left w:val="single" w:color="BBBBBB" w:sz="4"/>
-              <w:bottom w:val="single" w:color="BBBBBB" w:sz="4"/>
-              <w:right w:val="single" w:color="BBBBBB" w:sz="4"/>
-            </w:tcBorders>
-            <w:tcMar>
-              <w:top w:type="dxa" w:w="60"/>
-              <w:left w:type="dxa" w:w="100"/>
-              <w:bottom w:type="dxa" w:w="60"/>
-              <w:right w:type="dxa" w:w="100"/>
-            </w:tcMar>
-          </w:tcPr>
-          <w:p>
-            <w:pPr>
-              <w:jc w:val="left"/>
-            </w:pPr>
-            <w:r>
-              <w:rPr>
-                <w:b w:val="false"/>
-                <w:bCs w:val="false"/>
-                <w:sz w:val="20"/>
-                <w:szCs w:val="20"/>
-              </w:rPr>
-              <w:t xml:space="preserve">Platos anotados</w:t>
-            </w:r>
-          </w:p>
-        </w:tc>
-        <w:tc>
-          <w:tcPr>
-            <w:tcW w:type="dxa" w:w="4026"/>
+            <w:tcW w:type="dxa" w:w="4400"/>
+            <w:tcBorders>
+              <w:top w:val="single" w:color="BBBBBB" w:sz="4"/>
+              <w:left w:val="single" w:color="BBBBBB" w:sz="4"/>
+              <w:bottom w:val="single" w:color="BBBBBB" w:sz="4"/>
+              <w:right w:val="single" w:color="BBBBBB" w:sz="4"/>
+            </w:tcBorders>
+            <w:tcMar>
+              <w:top w:type="dxa" w:w="60"/>
+              <w:left w:type="dxa" w:w="100"/>
+              <w:bottom w:type="dxa" w:w="60"/>
+              <w:right w:type="dxa" w:w="100"/>
+            </w:tcMar>
+          </w:tcPr>
+          <w:p>
+            <w:pPr>
+              <w:jc w:val="left"/>
+            </w:pPr>
+            <w:r>
+              <w:rPr>
+                <w:b w:val="false"/>
+                <w:bCs w:val="false"/>
+                <w:sz w:val="20"/>
+                <w:szCs w:val="20"/>
+              </w:rPr>
+              <w:t xml:space="preserve">Meta: 250 platos × S/ 20</w:t>
+            </w:r>
+          </w:p>
+        </w:tc>
+        <w:tc>
+          <w:tcPr>
+            <w:tcW w:type="dxa" w:w="2313"/>
             <w:tcBorders>
               <w:top w:val="single" w:color="BBBBBB" w:sz="4"/>
               <w:left w:val="single" w:color="BBBBBB" w:sz="4"/>
@@ -568,7 +901,40 @@
                 <w:sz w:val="20"/>
                 <w:szCs w:val="20"/>
               </w:rPr>
-              <w:t xml:space="preserve">230 platos</w:t>
+              <w:t xml:space="preserve">S/ 5,000</w:t>
+            </w:r>
+          </w:p>
+        </w:tc>
+        <w:tc>
+          <w:tcPr>
+            <w:tcW w:type="dxa" w:w="2313"/>
+            <w:tcBorders>
+              <w:top w:val="single" w:color="BBBBBB" w:sz="4"/>
+              <w:left w:val="single" w:color="BBBBBB" w:sz="4"/>
+              <w:bottom w:val="single" w:color="BBBBBB" w:sz="4"/>
+              <w:right w:val="single" w:color="BBBBBB" w:sz="4"/>
+            </w:tcBorders>
+            <w:shd w:fill="FAFAFA" w:color="auto" w:val="clear"/>
+            <w:tcMar>
+              <w:top w:type="dxa" w:w="60"/>
+              <w:left w:type="dxa" w:w="100"/>
+              <w:bottom w:type="dxa" w:w="60"/>
+              <w:right w:type="dxa" w:w="100"/>
+            </w:tcMar>
+          </w:tcPr>
+          <w:p>
+            <w:pPr>
+              <w:jc w:val="right"/>
+            </w:pPr>
+            <w:r>
+              <w:rPr>
+                <w:b w:val="false"/>
+                <w:bCs w:val="false"/>
+                <w:color w:val="777777"/>
+                <w:sz w:val="18"/>
+                <w:szCs w:val="18"/>
+              </w:rPr>
+              <w:t xml:space="preserve">S/ 5,000</w:t>
             </w:r>
           </w:p>
         </w:tc>
@@ -576,71 +942,7 @@
       <w:tr>
         <w:tc>
           <w:tcPr>
-            <w:tcW w:type="dxa" w:w="5000"/>
-            <w:tcBorders>
-              <w:top w:val="single" w:color="BBBBBB" w:sz="4"/>
-              <w:left w:val="single" w:color="BBBBBB" w:sz="4"/>
-              <w:bottom w:val="single" w:color="BBBBBB" w:sz="4"/>
-              <w:right w:val="single" w:color="BBBBBB" w:sz="4"/>
-            </w:tcBorders>
-            <w:tcMar>
-              <w:top w:type="dxa" w:w="60"/>
-              <w:left w:type="dxa" w:w="100"/>
-              <w:bottom w:type="dxa" w:w="60"/>
-              <w:right w:type="dxa" w:w="100"/>
-            </w:tcMar>
-          </w:tcPr>
-          <w:p>
-            <w:pPr>
-              <w:jc w:val="left"/>
-            </w:pPr>
-            <w:r>
-              <w:rPr>
-                <w:b w:val="false"/>
-                <w:bCs w:val="false"/>
-                <w:sz w:val="20"/>
-                <w:szCs w:val="20"/>
-              </w:rPr>
-              <w:t xml:space="preserve">Meta: 250 platos × S/ 20</w:t>
-            </w:r>
-          </w:p>
-        </w:tc>
-        <w:tc>
-          <w:tcPr>
-            <w:tcW w:type="dxa" w:w="4026"/>
-            <w:tcBorders>
-              <w:top w:val="single" w:color="BBBBBB" w:sz="4"/>
-              <w:left w:val="single" w:color="BBBBBB" w:sz="4"/>
-              <w:bottom w:val="single" w:color="BBBBBB" w:sz="4"/>
-              <w:right w:val="single" w:color="BBBBBB" w:sz="4"/>
-            </w:tcBorders>
-            <w:tcMar>
-              <w:top w:type="dxa" w:w="60"/>
-              <w:left w:type="dxa" w:w="100"/>
-              <w:bottom w:type="dxa" w:w="60"/>
-              <w:right w:type="dxa" w:w="100"/>
-            </w:tcMar>
-          </w:tcPr>
-          <w:p>
-            <w:pPr>
-              <w:jc w:val="right"/>
-            </w:pPr>
-            <w:r>
-              <w:rPr>
-                <w:b w:val="false"/>
-                <w:bCs w:val="false"/>
-                <w:sz w:val="20"/>
-                <w:szCs w:val="20"/>
-              </w:rPr>
-              <w:t xml:space="preserve">S/ 5,000</w:t>
-            </w:r>
-          </w:p>
-        </w:tc>
-      </w:tr>
-      <w:tr>
-        <w:tc>
-          <w:tcPr>
-            <w:tcW w:type="dxa" w:w="5000"/>
+            <w:tcW w:type="dxa" w:w="4400"/>
             <w:tcBorders>
               <w:top w:val="single" w:color="BBBBBB" w:sz="4"/>
               <w:left w:val="single" w:color="BBBBBB" w:sz="4"/>
@@ -671,7 +973,7 @@
         </w:tc>
         <w:tc>
           <w:tcPr>
-            <w:tcW w:type="dxa" w:w="4026"/>
+            <w:tcW w:type="dxa" w:w="2313"/>
             <w:tcBorders>
               <w:top w:val="single" w:color="BBBBBB" w:sz="4"/>
               <w:left w:val="single" w:color="BBBBBB" w:sz="4"/>
@@ -696,7 +998,40 @@
                 <w:sz w:val="20"/>
                 <w:szCs w:val="20"/>
               </w:rPr>
-              <w:t xml:space="preserve">S/ 400  (20 platos)</w:t>
+              <w:t xml:space="preserve">S/ 260 (13 platos)</w:t>
+            </w:r>
+          </w:p>
+        </w:tc>
+        <w:tc>
+          <w:tcPr>
+            <w:tcW w:type="dxa" w:w="2313"/>
+            <w:tcBorders>
+              <w:top w:val="single" w:color="BBBBBB" w:sz="4"/>
+              <w:left w:val="single" w:color="BBBBBB" w:sz="4"/>
+              <w:bottom w:val="single" w:color="BBBBBB" w:sz="4"/>
+              <w:right w:val="single" w:color="BBBBBB" w:sz="4"/>
+            </w:tcBorders>
+            <w:shd w:fill="FAFAFA" w:color="auto" w:val="clear"/>
+            <w:tcMar>
+              <w:top w:type="dxa" w:w="60"/>
+              <w:left w:type="dxa" w:w="100"/>
+              <w:bottom w:type="dxa" w:w="60"/>
+              <w:right w:type="dxa" w:w="100"/>
+            </w:tcMar>
+          </w:tcPr>
+          <w:p>
+            <w:pPr>
+              <w:jc w:val="right"/>
+            </w:pPr>
+            <w:r>
+              <w:rPr>
+                <w:b/>
+                <w:bCs/>
+                <w:color w:val="777777"/>
+                <w:sz w:val="18"/>
+                <w:szCs w:val="18"/>
+              </w:rPr>
+              <w:t xml:space="preserve">S/ 400</w:t>
             </w:r>
           </w:p>
         </w:tc>
@@ -725,7 +1060,7 @@
           <w:sz w:val="18"/>
           <w:szCs w:val="18"/>
         </w:rPr>
-        <w:t xml:space="preserve">Nota: la hoja POS del cuaderno dice total S/ 880, pero sumando fila por fila da S/ 900. Puede ser la corrección que se ve en la fila de Angélica; conviene comparar con el reporte del POS.</w:t>
+        <w:t xml:space="preserve">“Monto real” es el cuadre final de la pollada. “Suma de las listas” es lo que da sumar los nombres anotados en el cuaderno (tablas de abajo); la diferencia indica pagos que no quedaron anotados con nombre o con el método correcto.</w:t>
       </w:r>
     </w:p>
     <w:p>

</xml_diff>